<commit_message>
fix: remove imagens extras do circuito e deixa apenas o print do autor
- Remove circuito-nand-ativo.png e circuito-nand-inativo.png (criadas sem necessidade)
- Corrige secao de simulacao para usar apenas a imagem fornecida pelo usuario
- Regenera PDF (3 paginas) e DOCX
</commit_message>
<xml_diff>
--- a/disciplinas/gcetens838-logica-para-computacao/atividades/exercicios/gcetens838-simulacao-01-relatorio-deivison-santana.docx
+++ b/disciplinas/gcetens838-logica-para-computacao/atividades/exercicios/gcetens838-simulacao-01-relatorio-deivison-santana.docx
@@ -25,7 +25,7 @@
         <w:t xml:space="preserve">BACHARELADO EM SISTEMAS DE INFORMACAO (EAD)</w:t>
       </w:r>
     </w:p>
-    <w:bookmarkStart w:id="33" w:name="Xbd4099bf4629f5a4050926e13d1b10a4c11835e"/>
+    <w:bookmarkStart w:id="27" w:name="Xbd4099bf4629f5a4050926e13d1b10a4c11835e"/>
     <w:p>
       <w:pPr>
         <w:pStyle w:val="Heading1"/>
@@ -1011,7 +1011,7 @@
       </w:r>
     </w:p>
     <w:bookmarkEnd w:id="22"/>
-    <w:bookmarkStart w:id="32" w:name="simulacao-no-circuitverse"/>
+    <w:bookmarkStart w:id="26" w:name="simulacao-no-circuitverse"/>
     <w:p>
       <w:pPr>
         <w:pStyle w:val="Heading2"/>
@@ -1025,7 +1025,7 @@
         <w:pStyle w:val="FirstParagraph"/>
       </w:pPr>
       <w:r>
-        <w:t xml:space="preserve">Montei o circuito no CircuitVerse com 3 entradas (T, H, J), 3 portas NAND de 2 entradas e um LED de saida (S). A imagem abaixo mostra o circuito montado no simulador.</w:t>
+        <w:t xml:space="preserve">Montei o circuito no CircuitVerse com 3 entradas (T, H, J), 3 portas NAND de 2 entradas e um LED de saida (S). A imagem abaixo mostra o circuito montado no simulador com os estados ativo e inativo do alarme.</w:t>
       </w:r>
     </w:p>
     <w:p>
@@ -1037,7 +1037,7 @@
           <wp:inline>
             <wp:extent cx="5334000" cy="2983821"/>
             <wp:effectExtent b="0" l="0" r="0" t="0"/>
-            <wp:docPr descr="Circuito montado no CircuitVerse" title="" id="24" name="Picture"/>
+            <wp:docPr descr="Circuito montado no CircuitVerse — prints do autor" title="" id="24" name="Picture"/>
             <a:graphic>
               <a:graphicData uri="http://schemas.openxmlformats.org/drawingml/2006/picture">
                 <pic:pic>
@@ -1080,153 +1080,7 @@
         <w:pStyle w:val="ImageCaption"/>
       </w:pPr>
       <w:r>
-        <w:t xml:space="preserve">Circuito montado no CircuitVerse</w:t>
-      </w:r>
-    </w:p>
-    <w:p>
-      <w:pPr>
-        <w:pStyle w:val="BodyText"/>
-      </w:pPr>
-      <w:r>
-        <w:rPr>
-          <w:b/>
-          <w:bCs/>
-        </w:rPr>
-        <w:t xml:space="preserve">Estado ativo (S = 1):</w:t>
-      </w:r>
-      <w:r>
-        <w:t xml:space="preserve"> </w:t>
-      </w:r>
-      <w:r>
-        <w:t xml:space="preserve">T = 1, H = 0, J = 1 — temperatura alta e janela aberta, alarme acende.</w:t>
-      </w:r>
-    </w:p>
-    <w:p>
-      <w:pPr>
-        <w:pStyle w:val="CaptionedFigure"/>
-      </w:pPr>
-      <w:r>
-        <w:drawing>
-          <wp:inline>
-            <wp:extent cx="5334000" cy="2556986"/>
-            <wp:effectExtent b="0" l="0" r="0" t="0"/>
-            <wp:docPr descr="Circuito com alarme ativo" title="" id="27" name="Picture"/>
-            <a:graphic>
-              <a:graphicData uri="http://schemas.openxmlformats.org/drawingml/2006/picture">
-                <pic:pic>
-                  <pic:nvPicPr>
-                    <pic:cNvPr descr="disciplinas/gcetens838-logica-para-computacao/atividades/exercicios/circuito-nand-ativo.png" id="28" name="Picture"/>
-                    <pic:cNvPicPr>
-                      <a:picLocks noChangeArrowheads="1" noChangeAspect="1"/>
-                    </pic:cNvPicPr>
-                  </pic:nvPicPr>
-                  <pic:blipFill>
-                    <a:blip r:embed="rId26"/>
-                    <a:stretch>
-                      <a:fillRect/>
-                    </a:stretch>
-                  </pic:blipFill>
-                  <pic:spPr bwMode="auto">
-                    <a:xfrm>
-                      <a:off x="0" y="0"/>
-                      <a:ext cx="5334000" cy="2556986"/>
-                    </a:xfrm>
-                    <a:prstGeom prst="rect">
-                      <a:avLst/>
-                    </a:prstGeom>
-                    <a:noFill/>
-                    <a:ln w="9525">
-                      <a:noFill/>
-                      <a:headEnd/>
-                      <a:tailEnd/>
-                    </a:ln>
-                  </pic:spPr>
-                </pic:pic>
-              </a:graphicData>
-            </a:graphic>
-          </wp:inline>
-        </w:drawing>
-      </w:r>
-    </w:p>
-    <w:p>
-      <w:pPr>
-        <w:pStyle w:val="ImageCaption"/>
-      </w:pPr>
-      <w:r>
-        <w:t xml:space="preserve">Circuito com alarme ativo</w:t>
-      </w:r>
-    </w:p>
-    <w:p>
-      <w:pPr>
-        <w:pStyle w:val="BodyText"/>
-      </w:pPr>
-      <w:r>
-        <w:rPr>
-          <w:b/>
-          <w:bCs/>
-        </w:rPr>
-        <w:t xml:space="preserve">Estado inativo (S = 0):</w:t>
-      </w:r>
-      <w:r>
-        <w:t xml:space="preserve"> </w:t>
-      </w:r>
-      <w:r>
-        <w:t xml:space="preserve">T = 0, H = 0, J = 0 — situacao normal, alarme desligado.</w:t>
-      </w:r>
-    </w:p>
-    <w:p>
-      <w:pPr>
-        <w:pStyle w:val="CaptionedFigure"/>
-      </w:pPr>
-      <w:r>
-        <w:drawing>
-          <wp:inline>
-            <wp:extent cx="5334000" cy="2556986"/>
-            <wp:effectExtent b="0" l="0" r="0" t="0"/>
-            <wp:docPr descr="Circuito com alarme inativo" title="" id="30" name="Picture"/>
-            <a:graphic>
-              <a:graphicData uri="http://schemas.openxmlformats.org/drawingml/2006/picture">
-                <pic:pic>
-                  <pic:nvPicPr>
-                    <pic:cNvPr descr="disciplinas/gcetens838-logica-para-computacao/atividades/exercicios/circuito-nand-inativo.png" id="31" name="Picture"/>
-                    <pic:cNvPicPr>
-                      <a:picLocks noChangeArrowheads="1" noChangeAspect="1"/>
-                    </pic:cNvPicPr>
-                  </pic:nvPicPr>
-                  <pic:blipFill>
-                    <a:blip r:embed="rId29"/>
-                    <a:stretch>
-                      <a:fillRect/>
-                    </a:stretch>
-                  </pic:blipFill>
-                  <pic:spPr bwMode="auto">
-                    <a:xfrm>
-                      <a:off x="0" y="0"/>
-                      <a:ext cx="5334000" cy="2556986"/>
-                    </a:xfrm>
-                    <a:prstGeom prst="rect">
-                      <a:avLst/>
-                    </a:prstGeom>
-                    <a:noFill/>
-                    <a:ln w="9525">
-                      <a:noFill/>
-                      <a:headEnd/>
-                      <a:tailEnd/>
-                    </a:ln>
-                  </pic:spPr>
-                </pic:pic>
-              </a:graphicData>
-            </a:graphic>
-          </wp:inline>
-        </w:drawing>
-      </w:r>
-    </w:p>
-    <w:p>
-      <w:pPr>
-        <w:pStyle w:val="ImageCaption"/>
-      </w:pPr>
-      <w:r>
-        <w:t xml:space="preserve">Circuito com alarme inativo</w:t>
+        <w:t xml:space="preserve">Circuito montado no CircuitVerse — prints do autor</w:t>
       </w:r>
     </w:p>
     <w:p>
@@ -1252,8 +1106,8 @@
         <w:t xml:space="preserve">Relatorio entregue em 08 de julho de 2026</w:t>
       </w:r>
     </w:p>
-    <w:bookmarkEnd w:id="32"/>
-    <w:bookmarkEnd w:id="33"/>
+    <w:bookmarkEnd w:id="26"/>
+    <w:bookmarkEnd w:id="27"/>
     <w:sectPr>
       <w:footnotePr>
         <w:numRestart w:val="eachSect"/>

</xml_diff>